<commit_message>
Strengthen DDX24 preprint evidence structure
</commit_message>
<xml_diff>
--- a/paper/ddx24-preprint/DDX24_preprint_Joao_Pais_Diana_Koshman.docx
+++ b/paper/ddx24-preprint/DDX24_preprint_Joao_Pais_Diana_Koshman.docx
@@ -98,7 +98,7 @@
           <w:color w:val="5A626C"/>
           <w:sz w:val="20"/>
         </w:rPr>
-        <w:t>Primary synthesis: 2 CD8 cohorts, 47 participants • 5 additional contextual blood cohorts</w:t>
+        <w:t>8 independent cohorts • 217 participants mapped • Primary CD8 synthesis: 2 cohorts, 47 participants</w:t>
       </w:r>
     </w:p>
     <w:p>
@@ -155,7 +155,7 @@
           <w:i w:val="0"/>
           <w:sz w:val="22"/>
         </w:rPr>
-        <w:t>We performed a reproducible secondary integration of seven independent human case-control cohorts. Donors, never cells, were the statistical units. Compatible effects were pooled only within two predeclared strata: donor-pseudobulk CD8 single-cell RNA sequencing and normalized peripheral-blood microarrays. Incompatible whole-blood RNA-sequencing scales were summarized directionally. Batch adjustment, leave-one-participant-out sensitivity and cross-context concordance were assessed. ADA was retained as a contextual comparison target.</w:t>
+        <w:t>We performed a staged, reproducible secondary integration of eight independent human case-control cohorts. Three peripheral-blood microarray cohorts formed the candidate-generation stage. GSE194315 provided CD8 cell-context refinement; the expected lower-in-case direction was then locked before evaluation of GSE288581 as the external CD8 validation cohort. These two compatible CD8 cohorts formed the primary meta-analysis. GSE163314 was added only as a broader-CD8 sensitivity analysis. Two whole-blood RNA-sequencing cohorts and the three discovery microarrays were retained as contextual evidence and were not treated as independent confirmation of target selection. Donors, never cells, were the statistical units. [2] [3]</w:t>
       </w:r>
     </w:p>
     <w:p>
@@ -177,7 +177,7 @@
           <w:i w:val="0"/>
           <w:sz w:val="22"/>
         </w:rPr>
-        <w:t>The analysis included 7 independent cohorts and 213 participants. DDX24 was lower in cases in 6 of 7 cohorts. Across two independent CD8 cohorts (47 participants), the pooled effect was -0.148 log2-CPM (p=0.0193). Three peripheral-blood microarray cohorts (146 participants) were directionally concordant, although the random-effects result was imprecise (effect=-0.267, p=0.109) and heterogeneous. Two whole-blood RNA-sequencing cohorts were directionally mixed. ADA was mixed across contexts (4 of 7 cohorts lower).</w:t>
+        <w:t>The complete descriptive evidence map included 8 independent cohorts and 217 participants. Across two compatible CD8 cohorts (47 participants), the pooled effect was -0.148 log2-CPM (95% CI -0.272 to -0.024; p=0.0193). Adding the independent broad-CD8 GSE163314 pilot produced a sensitivity estimate of -0.145 (95% CI -0.249 to -0.041; p=0.0061; 51 participants). Three candidate-generation peripheral-blood microarray cohorts (146 participants) were directionally concordant, although the random-effects result was imprecise (effect=-0.267, p=0.109) and heterogeneous. Two whole-blood RNA-sequencing cohorts were directionally mixed. ADA was mixed across contexts (4 of 7 cohorts lower).</w:t>
       </w:r>
     </w:p>
     <w:p>
@@ -199,7 +199,7 @@
           <w:i w:val="0"/>
           <w:sz w:val="22"/>
         </w:rPr>
-        <w:t>DDX24 shows a recurrent, within-CD8 reduction in ankylosing spondylitis and broader directional support across blood cohorts. The evidence supports a falsification-focused laboratory study but does not establish causality, druggability or therapeutic efficacy.</w:t>
+        <w:t>DDX24 showed a lower-in-case association in the prespecified CD8 synthesis and retained that direction in a broader-CD8 sensitivity analysis. Evidence from the candidate-generation and contextual blood cohorts supports biological follow-up but is not additional confirmatory evidence. The result supports a falsification-focused laboratory study but does not establish causality, diagnostic validity, druggability or therapeutic efficacy.</w:t>
       </w:r>
     </w:p>
     <w:p>
@@ -221,7 +221,7 @@
           <w:i w:val="0"/>
           <w:sz w:val="22"/>
         </w:rPr>
-        <w:t>Blood transcriptomic studies of ankylosing spondylitis vary in participant selection, cellular composition and assay technology. Pooling all such effects into one estimate can obscure genuine cell-state specificity. DDX24 emerged from the AXIS discovery workflow as a recurrent candidate and is biologically relevant to innate RNA-sensing pathways. The present study asked a narrower question: is reduced DDX24 expression reproducible within human peripheral CD8 T-cell populations, and is its direction supported in independent blood cohorts? [1]</w:t>
+        <w:t>Blood transcriptomic studies of ankylosing spondylitis vary in participant selection, cellular composition and assay technology. Pooling all such effects into one estimate can obscure genuine cell-state specificity. DDX24 emerged from three AXIS peripheral-blood microarray discovery cohorts as a recurrent candidate [8] and is biologically relevant to innate RNA-sensing pathways [1]. The present study asked a narrower question: is reduced DDX24 expression reproducible within human peripheral CD8 T-cell populations, and is its direction supported in independent blood cohorts?</w:t>
       </w:r>
     </w:p>
     <w:p>
@@ -251,7 +251,7 @@
           <w:i w:val="0"/>
           <w:sz w:val="22"/>
         </w:rPr>
-        <w:t>Public human case-control transcriptomic cohorts were eligible when disease and control groups could be separated at participant level. Repeated assays, technical libraries and cells were not counted as independent observations. Studies without healthy controls, pooled participants without donor resolution, or non-expression assays were excluded from inferential synthesis.</w:t>
+        <w:t>Public human case-control transcriptomic cohorts were eligible when disease and control groups could be separated at participant level. Evidence roles were assigned before synthesis: candidate generation, cell-context refinement, locked external validation, sensitivity, or contextual evidence. A study used to nominate DDX24 was never relabelled as independent validation. Repeated assays, technical libraries and cells were not counted as independent observations. Studies without healthy controls, pooled participants without donor resolution, or non-expression assays were excluded from inferential synthesis.</w:t>
       </w:r>
     </w:p>
     <w:p>
@@ -273,7 +273,7 @@
           <w:i w:val="0"/>
           <w:sz w:val="22"/>
         </w:rPr>
-        <w:t>DDX24 and its expected lower-in-case direction were frozen before the next dataset. The primary outcome was case-minus-control DDX24 expression in memory/effector CD8 cells. ADA was analysed identically as a comparison target.</w:t>
+        <w:t>DDX24 was nominated from GSE25101, GSE18781 and GSE73754, then localized to CD8 states in GSE194315. Its expected lower-in-case direction and participant-level primary outcome were frozen before GSE288581 was evaluated. The primary outcome was case-minus-control DDX24 expression in compatible memory/effector CD8 populations. GSE163314 used a broader author-annotated CD8_T population and was therefore sensitivity-only. ADA was analysed identically as a contextual comparison target, not as a multiplicity correction for DDX24 selection. [2] [3]</w:t>
       </w:r>
     </w:p>
     <w:p>
@@ -295,7 +295,7 @@
           <w:i w:val="0"/>
           <w:sz w:val="22"/>
         </w:rPr>
-        <w:t>Within compatible strata, inverse-variance random-effects models were used. CD8 effects were derived from donor pseudobulk log2-CPM. Microarray effects were case-minus-control normalized log expression. Whole-blood FPKM and long-read TPM studies were reported directionally and were not pooled with CD8 or microarray effects. No global cross-platform effect or p-value was estimated.</w:t>
+        <w:t>Within compatible strata, inverse-variance DerSimonian-Laird random-effects models were used [11]. CD8 effects were derived from donor pseudobulk log2-CPM, preserving the participant as the unit of replication [9]. Microarray effects were case-minus-control normalized log expression. Whole-blood FPKM and long-read TPM studies were reported directionally and were not pooled with CD8 or microarray effects. No global cross-platform effect or p-value was estimated.</w:t>
       </w:r>
     </w:p>
     <w:p>
@@ -347,7 +347,7 @@
           <w:i w:val="0"/>
           <w:sz w:val="22"/>
         </w:rPr>
-        <w:t>Both CD8 cohorts showed lower DDX24 expression in cases. The pooled CD8 estimate excluded zero, and every donor omission in the external cohort preserved the direction. In GSE194315, CD8 TEM and CD8 Naive directions also persisted after processing-batch adjustment and participant omission. [2]</w:t>
+        <w:t>Both compatible CD8 cohorts showed lower DDX24 expression in cases. The pooled CD8 estimate was -0.148 log2-CPM (95% CI -0.272 to -0.024; p=0.0193), and every donor omission in the external cohort preserved the direction. In GSE194315, CD8 TEM and CD8 Naive directions also persisted after processing-batch adjustment and participant omission. The broader-CD8 GSE163314 pilot included only two cases and two controls and was individually imprecise (effect -0.155; p=0.478). Adding it as cell-definition sensitivity retained the combined direction (effect -0.145; 95% CI -0.249 to -0.041; p=0.0061). [2]</w:t>
       </w:r>
     </w:p>
     <w:p>
@@ -369,7 +369,7 @@
           <w:i w:val="0"/>
           <w:sz w:val="22"/>
         </w:rPr>
-        <w:t>All three microarray cohorts showed lower DDX24 expression, but magnitude varied substantially and the random-effects confidence interval included zero. The whole-blood RNA-sequencing stratum was mixed (1 lower and 1 higher). Consequently, the evidence is best interpreted as a robust CD8 association with broader but heterogeneous blood support.</w:t>
+        <w:t>All three candidate-generation microarray cohorts showed lower DDX24 expression, but magnitude varied substantially and the random-effects confidence interval included zero. The whole-blood RNA-sequencing stratum was mixed (1 lower and 1 higher). Consequently, the evidence is best interpreted as a robust CD8 association with broader but heterogeneous blood support.</w:t>
       </w:r>
     </w:p>
     <w:p>
@@ -413,7 +413,7 @@
           <w:i w:val="0"/>
           <w:sz w:val="22"/>
         </w:rPr>
-        <w:t>The main contribution is not a new global transcriptomic signature, but a carefully bounded observation: DDX24 is repeatedly lower within CD8 populations from people with ankylosing spondylitis. Participant-level analyses reduce the risk of cell-level pseudoreplication, while the independent sorted-CD8 cohort reduces reliance on one atlas. Nevertheless, residual clinical confounding, small external cohorts and cross-platform heterogeneity remain.</w:t>
+        <w:t>The main contribution is not a new global transcriptomic signature, but a carefully bounded observation: after nomination in bulk blood and cell-context refinement, the lower-in-case DDX24 direction persisted in a locked external CD8 cohort and in the compatible two-cohort synthesis. Participant-level analyses reduce the risk of cell-level pseudoreplication, while the independent sorted-CD8 cohort reduces reliance on one atlas. Nevertheless, residual clinical confounding, small external cohorts and cross-platform heterogeneity remain.</w:t>
       </w:r>
     </w:p>
     <w:p>
@@ -449,7 +449,7 @@
           <w:i w:val="0"/>
           <w:sz w:val="22"/>
         </w:rPr>
-        <w:t>Age, sex, medication and disease activity could not be adjusted consistently. The CD8 meta-analysis contains only two independent cohorts. Whole-blood RNA-sequencing studies disagree directionally. No human genetic association currently establishes DDX24 causality, and no perturbation result establishes therapeutic direction.</w:t>
+        <w:t>Age, sex, medication and disease activity could not be adjusted consistently. The CD8 meta-analysis contains only two independent cohorts, one of which contributed to cell-context refinement before the external direction was locked. Thus, the pooled p-value is not equivalent to two prospective confirmations. The broad-CD8 sensitivity cohort contains only four participants. Whole-blood RNA-sequencing studies disagree directionally. No human genetic association currently establishes DDX24 causality, and no perturbation result establishes therapeutic direction.</w:t>
       </w:r>
     </w:p>
     <w:p>
@@ -682,8 +682,64 @@
       <w:r>
         <w:drawing>
           <wp:inline xmlns:a="http://schemas.openxmlformats.org/drawingml/2006/main" xmlns:pic="http://schemas.openxmlformats.org/drawingml/2006/picture">
+            <wp:extent cx="5806440" cy="2758059"/>
+            <wp:docPr id="1" name="Picture 1" descr="Figure 1. Participant-level DDX24 effects in the two compatible CD8 cohorts and their random-effects synthesis. Negative values indicate lower donor-pseudobulk log2-CPM in cases. GSE194315 provided cell-context refinement; the direction was locked before external evaluation in GSE288581." title="Figure 1"/>
+            <wp:cNvGraphicFramePr>
+              <a:graphicFrameLocks noChangeAspect="1"/>
+            </wp:cNvGraphicFramePr>
+            <a:graphic>
+              <a:graphicData uri="http://schemas.openxmlformats.org/drawingml/2006/picture">
+                <pic:pic>
+                  <pic:nvPicPr>
+                    <pic:cNvPr id="0" name="figure-4-cd8-forest.png"/>
+                    <pic:cNvPicPr/>
+                  </pic:nvPicPr>
+                  <pic:blipFill>
+                    <a:blip r:embed="rId11"/>
+                    <a:stretch>
+                      <a:fillRect/>
+                    </a:stretch>
+                  </pic:blipFill>
+                  <pic:spPr>
+                    <a:xfrm>
+                      <a:off x="0" y="0"/>
+                      <a:ext cx="5806440" cy="2758059"/>
+                    </a:xfrm>
+                    <a:prstGeom prst="rect"/>
+                  </pic:spPr>
+                </pic:pic>
+              </a:graphicData>
+            </a:graphic>
+          </wp:inline>
+        </w:drawing>
+      </w:r>
+    </w:p>
+    <w:p>
+      <w:pPr>
+        <w:spacing w:after="280"/>
+        <w:jc w:val="left"/>
+      </w:pPr>
+      <w:r>
+        <w:rPr>
+          <w:rFonts w:ascii="Calibri" w:hAnsi="Calibri"/>
+          <w:b w:val="0"/>
+          <w:i/>
+          <w:color w:val="5A626C"/>
+          <w:sz w:val="19"/>
+        </w:rPr>
+        <w:t>Figure 1. Participant-level DDX24 effects in the two compatible CD8 cohorts and their random-effects synthesis. Negative values indicate lower donor-pseudobulk log2-CPM in cases. GSE194315 provided cell-context refinement; the direction was locked before external evaluation in GSE288581.</w:t>
+      </w:r>
+    </w:p>
+    <w:p>
+      <w:pPr>
+        <w:keepNext/>
+        <w:jc w:val="center"/>
+      </w:pPr>
+      <w:r>
+        <w:drawing>
+          <wp:inline xmlns:a="http://schemas.openxmlformats.org/drawingml/2006/main" xmlns:pic="http://schemas.openxmlformats.org/drawingml/2006/picture">
             <wp:extent cx="5806440" cy="2157820"/>
-            <wp:docPr id="1" name="Picture 1" descr="Figure 1. DDX24 case-minus-control effects in seven independent cohorts, separated into compatible assay contexts. Negative values indicate lower expression in cases. Effects are not pooled across panels because assay scales differ." title="Figure 1"/>
+            <wp:docPr id="2" name="Picture 2" descr="Figure 2. DDX24 case-minus-control effects in seven independent cohorts, separated into compatible assay contexts. Negative values indicate lower expression in cases. Effects are not pooled across panels because assay scales differ. The later GSE163314 broad-CD8 sensitivity cohort is reported separately in the text and Table 1." title="Figure 2"/>
             <wp:cNvGraphicFramePr>
               <a:graphicFrameLocks noChangeAspect="1"/>
             </wp:cNvGraphicFramePr>
@@ -695,7 +751,7 @@
                     <pic:cNvPicPr/>
                   </pic:nvPicPr>
                   <pic:blipFill>
-                    <a:blip r:embed="rId11"/>
+                    <a:blip r:embed="rId12"/>
                     <a:stretch>
                       <a:fillRect/>
                     </a:stretch>
@@ -727,7 +783,7 @@
           <w:color w:val="5A626C"/>
           <w:sz w:val="19"/>
         </w:rPr>
-        <w:t>Figure 1. DDX24 case-minus-control effects in seven independent cohorts, separated into compatible assay contexts. Negative values indicate lower expression in cases. Effects are not pooled across panels because assay scales differ.</w:t>
+        <w:t>Figure 2. DDX24 case-minus-control effects in seven independent cohorts, separated into compatible assay contexts. Negative values indicate lower expression in cases. Effects are not pooled across panels because assay scales differ. The later GSE163314 broad-CD8 sensitivity cohort is reported separately in the text and Table 1.</w:t>
       </w:r>
     </w:p>
     <w:p>
@@ -739,7 +795,7 @@
         <w:drawing>
           <wp:inline xmlns:a="http://schemas.openxmlformats.org/drawingml/2006/main" xmlns:pic="http://schemas.openxmlformats.org/drawingml/2006/picture">
             <wp:extent cx="5806440" cy="2502951"/>
-            <wp:docPr id="2" name="Picture 2" descr="Figure 2. Directional concordance for DDX24 and ADA. Values show the fraction of independent cohorts within each context whose case-minus-control effect was below zero." title="Figure 2"/>
+            <wp:docPr id="3" name="Picture 3" descr="Figure 3. Directional concordance for DDX24 and ADA. Values show the fraction of independent cohorts within each context whose case-minus-control effect was below zero." title="Figure 3"/>
             <wp:cNvGraphicFramePr>
               <a:graphicFrameLocks noChangeAspect="1"/>
             </wp:cNvGraphicFramePr>
@@ -751,7 +807,7 @@
                     <pic:cNvPicPr/>
                   </pic:nvPicPr>
                   <pic:blipFill>
-                    <a:blip r:embed="rId12"/>
+                    <a:blip r:embed="rId13"/>
                     <a:stretch>
                       <a:fillRect/>
                     </a:stretch>
@@ -783,7 +839,7 @@
           <w:color w:val="5A626C"/>
           <w:sz w:val="19"/>
         </w:rPr>
-        <w:t>Figure 2. Directional concordance for DDX24 and ADA. Values show the fraction of independent cohorts within each context whose case-minus-control effect was below zero.</w:t>
+        <w:t>Figure 3. Directional concordance for DDX24 and ADA. Values show the fraction of independent cohorts within each context whose case-minus-control effect was below zero.</w:t>
       </w:r>
     </w:p>
     <w:p>
@@ -807,12 +863,13 @@
         <w:tblLook w:firstColumn="1" w:firstRow="1" w:lastColumn="0" w:lastRow="0" w:noHBand="0" w:noVBand="1" w:val="04A0"/>
       </w:tblPr>
       <w:tblGrid>
-        <w:gridCol w:w="1560"/>
-        <w:gridCol w:w="1560"/>
-        <w:gridCol w:w="1560"/>
-        <w:gridCol w:w="1560"/>
-        <w:gridCol w:w="1560"/>
-        <w:gridCol w:w="1560"/>
+        <w:gridCol w:w="1337"/>
+        <w:gridCol w:w="1337"/>
+        <w:gridCol w:w="1337"/>
+        <w:gridCol w:w="1337"/>
+        <w:gridCol w:w="1337"/>
+        <w:gridCol w:w="1337"/>
+        <w:gridCol w:w="1337"/>
       </w:tblGrid>
       <w:tr>
         <w:trPr>
@@ -820,7 +877,7 @@
         </w:trPr>
         <w:tc>
           <w:tcPr>
-            <w:tcW w:type="dxa" w:w="1350"/>
+            <w:tcW w:type="dxa" w:w="1050"/>
             <w:shd w:fill="E8EEF5"/>
             <w:vAlign w:val="center"/>
           </w:tcPr>
@@ -842,7 +899,7 @@
         </w:tc>
         <w:tc>
           <w:tcPr>
-            <w:tcW w:type="dxa" w:w="3000"/>
+            <w:tcW w:type="dxa" w:w="1750"/>
             <w:shd w:fill="E8EEF5"/>
             <w:vAlign w:val="center"/>
           </w:tcPr>
@@ -864,7 +921,7 @@
         </w:tc>
         <w:tc>
           <w:tcPr>
-            <w:tcW w:type="dxa" w:w="900"/>
+            <w:tcW w:type="dxa" w:w="650"/>
             <w:shd w:fill="E8EEF5"/>
             <w:vAlign w:val="center"/>
           </w:tcPr>
@@ -886,7 +943,7 @@
         </w:tc>
         <w:tc>
           <w:tcPr>
-            <w:tcW w:type="dxa" w:w="900"/>
+            <w:tcW w:type="dxa" w:w="750"/>
             <w:shd w:fill="E8EEF5"/>
             <w:vAlign w:val="center"/>
           </w:tcPr>
@@ -908,7 +965,7 @@
         </w:tc>
         <w:tc>
           <w:tcPr>
-            <w:tcW w:type="dxa" w:w="1100"/>
+            <w:tcW w:type="dxa" w:w="900"/>
             <w:shd w:fill="E8EEF5"/>
             <w:vAlign w:val="center"/>
           </w:tcPr>
@@ -930,7 +987,7 @@
         </w:tc>
         <w:tc>
           <w:tcPr>
-            <w:tcW w:type="dxa" w:w="2110"/>
+            <w:tcW w:type="dxa" w:w="1300"/>
             <w:shd w:fill="E8EEF5"/>
             <w:vAlign w:val="center"/>
           </w:tcPr>
@@ -950,6 +1007,28 @@
             </w:r>
           </w:p>
         </w:tc>
+        <w:tc>
+          <w:tcPr>
+            <w:tcW w:type="dxa" w:w="2960"/>
+            <w:shd w:fill="E8EEF5"/>
+            <w:vAlign w:val="center"/>
+          </w:tcPr>
+          <w:p>
+            <w:pPr>
+              <w:jc w:val="center"/>
+            </w:pPr>
+            <w:r>
+              <w:rPr>
+                <w:rFonts w:ascii="Calibri" w:hAnsi="Calibri"/>
+                <w:b/>
+                <w:i w:val="0"/>
+                <w:color w:val="1F4D78"/>
+                <w:sz w:val="18"/>
+              </w:rPr>
+              <w:t>Evidence role</w:t>
+            </w:r>
+          </w:p>
+        </w:tc>
       </w:tr>
       <w:tr>
         <w:trPr>
@@ -957,7 +1036,7 @@
         </w:trPr>
         <w:tc>
           <w:tcPr>
-            <w:tcW w:type="dxa" w:w="1350"/>
+            <w:tcW w:type="dxa" w:w="1050"/>
             <w:vAlign w:val="center"/>
           </w:tcPr>
           <w:p>
@@ -969,7 +1048,7 @@
                 <w:rFonts w:ascii="Calibri" w:hAnsi="Calibri"/>
                 <w:b w:val="0"/>
                 <w:i w:val="0"/>
-                <w:sz w:val="17"/>
+                <w:sz w:val="16"/>
               </w:rPr>
               <w:t>GSE194315</w:t>
             </w:r>
@@ -977,7 +1056,7 @@
         </w:tc>
         <w:tc>
           <w:tcPr>
-            <w:tcW w:type="dxa" w:w="3000"/>
+            <w:tcW w:type="dxa" w:w="1750"/>
             <w:vAlign w:val="center"/>
           </w:tcPr>
           <w:p>
@@ -989,9 +1068,49 @@
                 <w:rFonts w:ascii="Calibri" w:hAnsi="Calibri"/>
                 <w:b w:val="0"/>
                 <w:i w:val="0"/>
-                <w:sz w:val="17"/>
+                <w:sz w:val="16"/>
               </w:rPr>
               <w:t>CD8 single cell</w:t>
+            </w:r>
+          </w:p>
+        </w:tc>
+        <w:tc>
+          <w:tcPr>
+            <w:tcW w:type="dxa" w:w="650"/>
+            <w:vAlign w:val="center"/>
+          </w:tcPr>
+          <w:p>
+            <w:pPr>
+              <w:jc w:val="center"/>
+            </w:pPr>
+            <w:r>
+              <w:rPr>
+                <w:rFonts w:ascii="Calibri" w:hAnsi="Calibri"/>
+                <w:b w:val="0"/>
+                <w:i w:val="0"/>
+                <w:sz w:val="16"/>
+              </w:rPr>
+              <w:t>10</w:t>
+            </w:r>
+          </w:p>
+        </w:tc>
+        <w:tc>
+          <w:tcPr>
+            <w:tcW w:type="dxa" w:w="750"/>
+            <w:vAlign w:val="center"/>
+          </w:tcPr>
+          <w:p>
+            <w:pPr>
+              <w:jc w:val="center"/>
+            </w:pPr>
+            <w:r>
+              <w:rPr>
+                <w:rFonts w:ascii="Calibri" w:hAnsi="Calibri"/>
+                <w:b w:val="0"/>
+                <w:i w:val="0"/>
+                <w:sz w:val="16"/>
+              </w:rPr>
+              <w:t>29</w:t>
             </w:r>
           </w:p>
         </w:tc>
@@ -1009,15 +1128,15 @@
                 <w:rFonts w:ascii="Calibri" w:hAnsi="Calibri"/>
                 <w:b w:val="0"/>
                 <w:i w:val="0"/>
-                <w:sz w:val="17"/>
+                <w:sz w:val="16"/>
               </w:rPr>
-              <w:t>10</w:t>
+              <w:t>-0.230</w:t>
             </w:r>
           </w:p>
         </w:tc>
         <w:tc>
           <w:tcPr>
-            <w:tcW w:type="dxa" w:w="900"/>
+            <w:tcW w:type="dxa" w:w="1300"/>
             <w:vAlign w:val="center"/>
           </w:tcPr>
           <w:p>
@@ -1029,15 +1148,15 @@
                 <w:rFonts w:ascii="Calibri" w:hAnsi="Calibri"/>
                 <w:b w:val="0"/>
                 <w:i w:val="0"/>
-                <w:sz w:val="17"/>
+                <w:sz w:val="16"/>
               </w:rPr>
-              <w:t>29</w:t>
+              <w:t>lower in case</w:t>
             </w:r>
           </w:p>
         </w:tc>
         <w:tc>
           <w:tcPr>
-            <w:tcW w:type="dxa" w:w="1100"/>
+            <w:tcW w:type="dxa" w:w="2960"/>
             <w:vAlign w:val="center"/>
           </w:tcPr>
           <w:p>
@@ -1049,15 +1168,20 @@
                 <w:rFonts w:ascii="Calibri" w:hAnsi="Calibri"/>
                 <w:b w:val="0"/>
                 <w:i w:val="0"/>
-                <w:sz w:val="17"/>
+                <w:sz w:val="16"/>
               </w:rPr>
-              <w:t>-0.230</w:t>
+              <w:t>compatible within CD8 pool</w:t>
             </w:r>
           </w:p>
         </w:tc>
+      </w:tr>
+      <w:tr>
+        <w:trPr>
+          <w:cantSplit/>
+        </w:trPr>
         <w:tc>
           <w:tcPr>
-            <w:tcW w:type="dxa" w:w="2110"/>
+            <w:tcW w:type="dxa" w:w="1050"/>
             <w:vAlign w:val="center"/>
           </w:tcPr>
           <w:p>
@@ -1069,20 +1193,15 @@
                 <w:rFonts w:ascii="Calibri" w:hAnsi="Calibri"/>
                 <w:b w:val="0"/>
                 <w:i w:val="0"/>
-                <w:sz w:val="17"/>
+                <w:sz w:val="16"/>
               </w:rPr>
-              <w:t>lower in case</w:t>
+              <w:t>GSE288581</w:t>
             </w:r>
           </w:p>
         </w:tc>
-      </w:tr>
-      <w:tr>
-        <w:trPr>
-          <w:cantSplit/>
-        </w:trPr>
         <w:tc>
           <w:tcPr>
-            <w:tcW w:type="dxa" w:w="1350"/>
+            <w:tcW w:type="dxa" w:w="1750"/>
             <w:vAlign w:val="center"/>
           </w:tcPr>
           <w:p>
@@ -1094,15 +1213,15 @@
                 <w:rFonts w:ascii="Calibri" w:hAnsi="Calibri"/>
                 <w:b w:val="0"/>
                 <w:i w:val="0"/>
-                <w:sz w:val="17"/>
+                <w:sz w:val="16"/>
               </w:rPr>
-              <w:t>GSE288581</w:t>
+              <w:t>CD8 single cell</w:t>
             </w:r>
           </w:p>
         </w:tc>
         <w:tc>
           <w:tcPr>
-            <w:tcW w:type="dxa" w:w="3000"/>
+            <w:tcW w:type="dxa" w:w="650"/>
             <w:vAlign w:val="center"/>
           </w:tcPr>
           <w:p>
@@ -1114,15 +1233,15 @@
                 <w:rFonts w:ascii="Calibri" w:hAnsi="Calibri"/>
                 <w:b w:val="0"/>
                 <w:i w:val="0"/>
-                <w:sz w:val="17"/>
+                <w:sz w:val="16"/>
               </w:rPr>
-              <w:t>CD8 single cell</w:t>
+              <w:t>4</w:t>
             </w:r>
           </w:p>
         </w:tc>
         <w:tc>
           <w:tcPr>
-            <w:tcW w:type="dxa" w:w="900"/>
+            <w:tcW w:type="dxa" w:w="750"/>
             <w:vAlign w:val="center"/>
           </w:tcPr>
           <w:p>
@@ -1134,7 +1253,7 @@
                 <w:rFonts w:ascii="Calibri" w:hAnsi="Calibri"/>
                 <w:b w:val="0"/>
                 <w:i w:val="0"/>
-                <w:sz w:val="17"/>
+                <w:sz w:val="16"/>
               </w:rPr>
               <w:t>4</w:t>
             </w:r>
@@ -1154,15 +1273,15 @@
                 <w:rFonts w:ascii="Calibri" w:hAnsi="Calibri"/>
                 <w:b w:val="0"/>
                 <w:i w:val="0"/>
-                <w:sz w:val="17"/>
+                <w:sz w:val="16"/>
               </w:rPr>
-              <w:t>4</w:t>
+              <w:t>-0.099</w:t>
             </w:r>
           </w:p>
         </w:tc>
         <w:tc>
           <w:tcPr>
-            <w:tcW w:type="dxa" w:w="1100"/>
+            <w:tcW w:type="dxa" w:w="1300"/>
             <w:vAlign w:val="center"/>
           </w:tcPr>
           <w:p>
@@ -1174,15 +1293,15 @@
                 <w:rFonts w:ascii="Calibri" w:hAnsi="Calibri"/>
                 <w:b w:val="0"/>
                 <w:i w:val="0"/>
-                <w:sz w:val="17"/>
+                <w:sz w:val="16"/>
               </w:rPr>
-              <w:t>-0.099</w:t>
+              <w:t>lower in case</w:t>
             </w:r>
           </w:p>
         </w:tc>
         <w:tc>
           <w:tcPr>
-            <w:tcW w:type="dxa" w:w="2110"/>
+            <w:tcW w:type="dxa" w:w="2960"/>
             <w:vAlign w:val="center"/>
           </w:tcPr>
           <w:p>
@@ -1194,9 +1313,9 @@
                 <w:rFonts w:ascii="Calibri" w:hAnsi="Calibri"/>
                 <w:b w:val="0"/>
                 <w:i w:val="0"/>
-                <w:sz w:val="17"/>
+                <w:sz w:val="16"/>
               </w:rPr>
-              <w:t>lower in case</w:t>
+              <w:t>compatible within CD8 pool</w:t>
             </w:r>
           </w:p>
         </w:tc>
@@ -1207,7 +1326,7 @@
         </w:trPr>
         <w:tc>
           <w:tcPr>
-            <w:tcW w:type="dxa" w:w="1350"/>
+            <w:tcW w:type="dxa" w:w="1050"/>
             <w:vAlign w:val="center"/>
           </w:tcPr>
           <w:p>
@@ -1219,15 +1338,15 @@
                 <w:rFonts w:ascii="Calibri" w:hAnsi="Calibri"/>
                 <w:b w:val="0"/>
                 <w:i w:val="0"/>
-                <w:sz w:val="17"/>
+                <w:sz w:val="16"/>
               </w:rPr>
-              <w:t>GSE25101</w:t>
+              <w:t>GSE163314</w:t>
             </w:r>
           </w:p>
         </w:tc>
         <w:tc>
           <w:tcPr>
-            <w:tcW w:type="dxa" w:w="3000"/>
+            <w:tcW w:type="dxa" w:w="1750"/>
             <w:vAlign w:val="center"/>
           </w:tcPr>
           <w:p>
@@ -1239,9 +1358,49 @@
                 <w:rFonts w:ascii="Calibri" w:hAnsi="Calibri"/>
                 <w:b w:val="0"/>
                 <w:i w:val="0"/>
-                <w:sz w:val="17"/>
+                <w:sz w:val="16"/>
               </w:rPr>
-              <w:t>peripheral blood microarray</w:t>
+              <w:t>broad CD8 single cell</w:t>
+            </w:r>
+          </w:p>
+        </w:tc>
+        <w:tc>
+          <w:tcPr>
+            <w:tcW w:type="dxa" w:w="650"/>
+            <w:vAlign w:val="center"/>
+          </w:tcPr>
+          <w:p>
+            <w:pPr>
+              <w:jc w:val="center"/>
+            </w:pPr>
+            <w:r>
+              <w:rPr>
+                <w:rFonts w:ascii="Calibri" w:hAnsi="Calibri"/>
+                <w:b w:val="0"/>
+                <w:i w:val="0"/>
+                <w:sz w:val="16"/>
+              </w:rPr>
+              <w:t>2</w:t>
+            </w:r>
+          </w:p>
+        </w:tc>
+        <w:tc>
+          <w:tcPr>
+            <w:tcW w:type="dxa" w:w="750"/>
+            <w:vAlign w:val="center"/>
+          </w:tcPr>
+          <w:p>
+            <w:pPr>
+              <w:jc w:val="center"/>
+            </w:pPr>
+            <w:r>
+              <w:rPr>
+                <w:rFonts w:ascii="Calibri" w:hAnsi="Calibri"/>
+                <w:b w:val="0"/>
+                <w:i w:val="0"/>
+                <w:sz w:val="16"/>
+              </w:rPr>
+              <w:t>2</w:t>
             </w:r>
           </w:p>
         </w:tc>
@@ -1259,7 +1418,132 @@
                 <w:rFonts w:ascii="Calibri" w:hAnsi="Calibri"/>
                 <w:b w:val="0"/>
                 <w:i w:val="0"/>
-                <w:sz w:val="17"/>
+                <w:sz w:val="16"/>
+              </w:rPr>
+              <w:t>-0.155</w:t>
+            </w:r>
+          </w:p>
+        </w:tc>
+        <w:tc>
+          <w:tcPr>
+            <w:tcW w:type="dxa" w:w="1300"/>
+            <w:vAlign w:val="center"/>
+          </w:tcPr>
+          <w:p>
+            <w:pPr>
+              <w:jc w:val="center"/>
+            </w:pPr>
+            <w:r>
+              <w:rPr>
+                <w:rFonts w:ascii="Calibri" w:hAnsi="Calibri"/>
+                <w:b w:val="0"/>
+                <w:i w:val="0"/>
+                <w:sz w:val="16"/>
+              </w:rPr>
+              <w:t>lower in case</w:t>
+            </w:r>
+          </w:p>
+        </w:tc>
+        <w:tc>
+          <w:tcPr>
+            <w:tcW w:type="dxa" w:w="2960"/>
+            <w:vAlign w:val="center"/>
+          </w:tcPr>
+          <w:p>
+            <w:pPr>
+              <w:jc w:val="center"/>
+            </w:pPr>
+            <w:r>
+              <w:rPr>
+                <w:rFonts w:ascii="Calibri" w:hAnsi="Calibri"/>
+                <w:b w:val="0"/>
+                <w:i w:val="0"/>
+                <w:sz w:val="16"/>
+              </w:rPr>
+              <w:t>sensitivity only broad CD8</w:t>
+            </w:r>
+          </w:p>
+        </w:tc>
+      </w:tr>
+      <w:tr>
+        <w:trPr>
+          <w:cantSplit/>
+        </w:trPr>
+        <w:tc>
+          <w:tcPr>
+            <w:tcW w:type="dxa" w:w="1050"/>
+            <w:vAlign w:val="center"/>
+          </w:tcPr>
+          <w:p>
+            <w:pPr>
+              <w:jc w:val="center"/>
+            </w:pPr>
+            <w:r>
+              <w:rPr>
+                <w:rFonts w:ascii="Calibri" w:hAnsi="Calibri"/>
+                <w:b w:val="0"/>
+                <w:i w:val="0"/>
+                <w:sz w:val="16"/>
+              </w:rPr>
+              <w:t>GSE25101</w:t>
+            </w:r>
+          </w:p>
+        </w:tc>
+        <w:tc>
+          <w:tcPr>
+            <w:tcW w:type="dxa" w:w="1750"/>
+            <w:vAlign w:val="center"/>
+          </w:tcPr>
+          <w:p>
+            <w:pPr>
+              <w:jc w:val="center"/>
+            </w:pPr>
+            <w:r>
+              <w:rPr>
+                <w:rFonts w:ascii="Calibri" w:hAnsi="Calibri"/>
+                <w:b w:val="0"/>
+                <w:i w:val="0"/>
+                <w:sz w:val="16"/>
+              </w:rPr>
+              <w:t>peripheral blood microarray</w:t>
+            </w:r>
+          </w:p>
+        </w:tc>
+        <w:tc>
+          <w:tcPr>
+            <w:tcW w:type="dxa" w:w="650"/>
+            <w:vAlign w:val="center"/>
+          </w:tcPr>
+          <w:p>
+            <w:pPr>
+              <w:jc w:val="center"/>
+            </w:pPr>
+            <w:r>
+              <w:rPr>
+                <w:rFonts w:ascii="Calibri" w:hAnsi="Calibri"/>
+                <w:b w:val="0"/>
+                <w:i w:val="0"/>
+                <w:sz w:val="16"/>
+              </w:rPr>
+              <w:t>16</w:t>
+            </w:r>
+          </w:p>
+        </w:tc>
+        <w:tc>
+          <w:tcPr>
+            <w:tcW w:type="dxa" w:w="750"/>
+            <w:vAlign w:val="center"/>
+          </w:tcPr>
+          <w:p>
+            <w:pPr>
+              <w:jc w:val="center"/>
+            </w:pPr>
+            <w:r>
+              <w:rPr>
+                <w:rFonts w:ascii="Calibri" w:hAnsi="Calibri"/>
+                <w:b w:val="0"/>
+                <w:i w:val="0"/>
+                <w:sz w:val="16"/>
               </w:rPr>
               <w:t>16</w:t>
             </w:r>
@@ -1279,15 +1563,15 @@
                 <w:rFonts w:ascii="Calibri" w:hAnsi="Calibri"/>
                 <w:b w:val="0"/>
                 <w:i w:val="0"/>
-                <w:sz w:val="17"/>
+                <w:sz w:val="16"/>
               </w:rPr>
-              <w:t>16</w:t>
+              <w:t>-0.435</w:t>
             </w:r>
           </w:p>
         </w:tc>
         <w:tc>
           <w:tcPr>
-            <w:tcW w:type="dxa" w:w="1100"/>
+            <w:tcW w:type="dxa" w:w="1300"/>
             <w:vAlign w:val="center"/>
           </w:tcPr>
           <w:p>
@@ -1299,15 +1583,15 @@
                 <w:rFonts w:ascii="Calibri" w:hAnsi="Calibri"/>
                 <w:b w:val="0"/>
                 <w:i w:val="0"/>
-                <w:sz w:val="17"/>
+                <w:sz w:val="16"/>
               </w:rPr>
-              <w:t>-0.435</w:t>
+              <w:t>lower in case</w:t>
             </w:r>
           </w:p>
         </w:tc>
         <w:tc>
           <w:tcPr>
-            <w:tcW w:type="dxa" w:w="2110"/>
+            <w:tcW w:type="dxa" w:w="2960"/>
             <w:vAlign w:val="center"/>
           </w:tcPr>
           <w:p>
@@ -1319,9 +1603,9 @@
                 <w:rFonts w:ascii="Calibri" w:hAnsi="Calibri"/>
                 <w:b w:val="0"/>
                 <w:i w:val="0"/>
-                <w:sz w:val="17"/>
+                <w:sz w:val="16"/>
               </w:rPr>
-              <w:t>lower in case</w:t>
+              <w:t>compatible within microarray pool</w:t>
             </w:r>
           </w:p>
         </w:tc>
@@ -1332,7 +1616,7 @@
         </w:trPr>
         <w:tc>
           <w:tcPr>
-            <w:tcW w:type="dxa" w:w="1350"/>
+            <w:tcW w:type="dxa" w:w="1050"/>
             <w:vAlign w:val="center"/>
           </w:tcPr>
           <w:p>
@@ -1344,7 +1628,7 @@
                 <w:rFonts w:ascii="Calibri" w:hAnsi="Calibri"/>
                 <w:b w:val="0"/>
                 <w:i w:val="0"/>
-                <w:sz w:val="17"/>
+                <w:sz w:val="16"/>
               </w:rPr>
               <w:t>GSE18781</w:t>
             </w:r>
@@ -1352,7 +1636,7 @@
         </w:tc>
         <w:tc>
           <w:tcPr>
-            <w:tcW w:type="dxa" w:w="3000"/>
+            <w:tcW w:type="dxa" w:w="1750"/>
             <w:vAlign w:val="center"/>
           </w:tcPr>
           <w:p>
@@ -1364,9 +1648,49 @@
                 <w:rFonts w:ascii="Calibri" w:hAnsi="Calibri"/>
                 <w:b w:val="0"/>
                 <w:i w:val="0"/>
-                <w:sz w:val="17"/>
+                <w:sz w:val="16"/>
               </w:rPr>
               <w:t>peripheral blood microarray</w:t>
+            </w:r>
+          </w:p>
+        </w:tc>
+        <w:tc>
+          <w:tcPr>
+            <w:tcW w:type="dxa" w:w="650"/>
+            <w:vAlign w:val="center"/>
+          </w:tcPr>
+          <w:p>
+            <w:pPr>
+              <w:jc w:val="center"/>
+            </w:pPr>
+            <w:r>
+              <w:rPr>
+                <w:rFonts w:ascii="Calibri" w:hAnsi="Calibri"/>
+                <w:b w:val="0"/>
+                <w:i w:val="0"/>
+                <w:sz w:val="16"/>
+              </w:rPr>
+              <w:t>18</w:t>
+            </w:r>
+          </w:p>
+        </w:tc>
+        <w:tc>
+          <w:tcPr>
+            <w:tcW w:type="dxa" w:w="750"/>
+            <w:vAlign w:val="center"/>
+          </w:tcPr>
+          <w:p>
+            <w:pPr>
+              <w:jc w:val="center"/>
+            </w:pPr>
+            <w:r>
+              <w:rPr>
+                <w:rFonts w:ascii="Calibri" w:hAnsi="Calibri"/>
+                <w:b w:val="0"/>
+                <w:i w:val="0"/>
+                <w:sz w:val="16"/>
+              </w:rPr>
+              <w:t>25</w:t>
             </w:r>
           </w:p>
         </w:tc>
@@ -1384,9 +1708,134 @@
                 <w:rFonts w:ascii="Calibri" w:hAnsi="Calibri"/>
                 <w:b w:val="0"/>
                 <w:i w:val="0"/>
-                <w:sz w:val="17"/>
+                <w:sz w:val="16"/>
               </w:rPr>
-              <w:t>18</w:t>
+              <w:t>-0.413</w:t>
+            </w:r>
+          </w:p>
+        </w:tc>
+        <w:tc>
+          <w:tcPr>
+            <w:tcW w:type="dxa" w:w="1300"/>
+            <w:vAlign w:val="center"/>
+          </w:tcPr>
+          <w:p>
+            <w:pPr>
+              <w:jc w:val="center"/>
+            </w:pPr>
+            <w:r>
+              <w:rPr>
+                <w:rFonts w:ascii="Calibri" w:hAnsi="Calibri"/>
+                <w:b w:val="0"/>
+                <w:i w:val="0"/>
+                <w:sz w:val="16"/>
+              </w:rPr>
+              <w:t>lower in case</w:t>
+            </w:r>
+          </w:p>
+        </w:tc>
+        <w:tc>
+          <w:tcPr>
+            <w:tcW w:type="dxa" w:w="2960"/>
+            <w:vAlign w:val="center"/>
+          </w:tcPr>
+          <w:p>
+            <w:pPr>
+              <w:jc w:val="center"/>
+            </w:pPr>
+            <w:r>
+              <w:rPr>
+                <w:rFonts w:ascii="Calibri" w:hAnsi="Calibri"/>
+                <w:b w:val="0"/>
+                <w:i w:val="0"/>
+                <w:sz w:val="16"/>
+              </w:rPr>
+              <w:t>compatible within microarray pool</w:t>
+            </w:r>
+          </w:p>
+        </w:tc>
+      </w:tr>
+      <w:tr>
+        <w:trPr>
+          <w:cantSplit/>
+        </w:trPr>
+        <w:tc>
+          <w:tcPr>
+            <w:tcW w:type="dxa" w:w="1050"/>
+            <w:vAlign w:val="center"/>
+          </w:tcPr>
+          <w:p>
+            <w:pPr>
+              <w:jc w:val="center"/>
+            </w:pPr>
+            <w:r>
+              <w:rPr>
+                <w:rFonts w:ascii="Calibri" w:hAnsi="Calibri"/>
+                <w:b w:val="0"/>
+                <w:i w:val="0"/>
+                <w:sz w:val="16"/>
+              </w:rPr>
+              <w:t>GSE73754</w:t>
+            </w:r>
+          </w:p>
+        </w:tc>
+        <w:tc>
+          <w:tcPr>
+            <w:tcW w:type="dxa" w:w="1750"/>
+            <w:vAlign w:val="center"/>
+          </w:tcPr>
+          <w:p>
+            <w:pPr>
+              <w:jc w:val="center"/>
+            </w:pPr>
+            <w:r>
+              <w:rPr>
+                <w:rFonts w:ascii="Calibri" w:hAnsi="Calibri"/>
+                <w:b w:val="0"/>
+                <w:i w:val="0"/>
+                <w:sz w:val="16"/>
+              </w:rPr>
+              <w:t>peripheral blood microarray</w:t>
+            </w:r>
+          </w:p>
+        </w:tc>
+        <w:tc>
+          <w:tcPr>
+            <w:tcW w:type="dxa" w:w="650"/>
+            <w:vAlign w:val="center"/>
+          </w:tcPr>
+          <w:p>
+            <w:pPr>
+              <w:jc w:val="center"/>
+            </w:pPr>
+            <w:r>
+              <w:rPr>
+                <w:rFonts w:ascii="Calibri" w:hAnsi="Calibri"/>
+                <w:b w:val="0"/>
+                <w:i w:val="0"/>
+                <w:sz w:val="16"/>
+              </w:rPr>
+              <w:t>51</w:t>
+            </w:r>
+          </w:p>
+        </w:tc>
+        <w:tc>
+          <w:tcPr>
+            <w:tcW w:type="dxa" w:w="750"/>
+            <w:vAlign w:val="center"/>
+          </w:tcPr>
+          <w:p>
+            <w:pPr>
+              <w:jc w:val="center"/>
+            </w:pPr>
+            <w:r>
+              <w:rPr>
+                <w:rFonts w:ascii="Calibri" w:hAnsi="Calibri"/>
+                <w:b w:val="0"/>
+                <w:i w:val="0"/>
+                <w:sz w:val="16"/>
+              </w:rPr>
+              <w:t>20</w:t>
             </w:r>
           </w:p>
         </w:tc>
@@ -1404,15 +1853,15 @@
                 <w:rFonts w:ascii="Calibri" w:hAnsi="Calibri"/>
                 <w:b w:val="0"/>
                 <w:i w:val="0"/>
-                <w:sz w:val="17"/>
+                <w:sz w:val="16"/>
               </w:rPr>
-              <w:t>25</w:t>
+              <w:t>-0.005</w:t>
             </w:r>
           </w:p>
         </w:tc>
         <w:tc>
           <w:tcPr>
-            <w:tcW w:type="dxa" w:w="1100"/>
+            <w:tcW w:type="dxa" w:w="1300"/>
             <w:vAlign w:val="center"/>
           </w:tcPr>
           <w:p>
@@ -1424,15 +1873,15 @@
                 <w:rFonts w:ascii="Calibri" w:hAnsi="Calibri"/>
                 <w:b w:val="0"/>
                 <w:i w:val="0"/>
-                <w:sz w:val="17"/>
+                <w:sz w:val="16"/>
               </w:rPr>
-              <w:t>-0.413</w:t>
+              <w:t>lower in case</w:t>
             </w:r>
           </w:p>
         </w:tc>
         <w:tc>
           <w:tcPr>
-            <w:tcW w:type="dxa" w:w="2110"/>
+            <w:tcW w:type="dxa" w:w="2960"/>
             <w:vAlign w:val="center"/>
           </w:tcPr>
           <w:p>
@@ -1444,9 +1893,9 @@
                 <w:rFonts w:ascii="Calibri" w:hAnsi="Calibri"/>
                 <w:b w:val="0"/>
                 <w:i w:val="0"/>
-                <w:sz w:val="17"/>
+                <w:sz w:val="16"/>
               </w:rPr>
-              <w:t>lower in case</w:t>
+              <w:t>compatible within microarray pool</w:t>
             </w:r>
           </w:p>
         </w:tc>
@@ -1457,7 +1906,7 @@
         </w:trPr>
         <w:tc>
           <w:tcPr>
-            <w:tcW w:type="dxa" w:w="1350"/>
+            <w:tcW w:type="dxa" w:w="1050"/>
             <w:vAlign w:val="center"/>
           </w:tcPr>
           <w:p>
@@ -1469,15 +1918,15 @@
                 <w:rFonts w:ascii="Calibri" w:hAnsi="Calibri"/>
                 <w:b w:val="0"/>
                 <w:i w:val="0"/>
-                <w:sz w:val="17"/>
+                <w:sz w:val="16"/>
               </w:rPr>
-              <w:t>GSE73754</w:t>
+              <w:t>GSE181364</w:t>
             </w:r>
           </w:p>
         </w:tc>
         <w:tc>
           <w:tcPr>
-            <w:tcW w:type="dxa" w:w="3000"/>
+            <w:tcW w:type="dxa" w:w="1750"/>
             <w:vAlign w:val="center"/>
           </w:tcPr>
           <w:p>
@@ -1489,9 +1938,49 @@
                 <w:rFonts w:ascii="Calibri" w:hAnsi="Calibri"/>
                 <w:b w:val="0"/>
                 <w:i w:val="0"/>
-                <w:sz w:val="17"/>
+                <w:sz w:val="16"/>
               </w:rPr>
-              <w:t>peripheral blood microarray</w:t>
+              <w:t>whole blood RNA sequencing</w:t>
+            </w:r>
+          </w:p>
+        </w:tc>
+        <w:tc>
+          <w:tcPr>
+            <w:tcW w:type="dxa" w:w="650"/>
+            <w:vAlign w:val="center"/>
+          </w:tcPr>
+          <w:p>
+            <w:pPr>
+              <w:jc w:val="center"/>
+            </w:pPr>
+            <w:r>
+              <w:rPr>
+                <w:rFonts w:ascii="Calibri" w:hAnsi="Calibri"/>
+                <w:b w:val="0"/>
+                <w:i w:val="0"/>
+                <w:sz w:val="16"/>
+              </w:rPr>
+              <w:t>5</w:t>
+            </w:r>
+          </w:p>
+        </w:tc>
+        <w:tc>
+          <w:tcPr>
+            <w:tcW w:type="dxa" w:w="750"/>
+            <w:vAlign w:val="center"/>
+          </w:tcPr>
+          <w:p>
+            <w:pPr>
+              <w:jc w:val="center"/>
+            </w:pPr>
+            <w:r>
+              <w:rPr>
+                <w:rFonts w:ascii="Calibri" w:hAnsi="Calibri"/>
+                <w:b w:val="0"/>
+                <w:i w:val="0"/>
+                <w:sz w:val="16"/>
+              </w:rPr>
+              <w:t>3</w:t>
             </w:r>
           </w:p>
         </w:tc>
@@ -1509,15 +1998,15 @@
                 <w:rFonts w:ascii="Calibri" w:hAnsi="Calibri"/>
                 <w:b w:val="0"/>
                 <w:i w:val="0"/>
-                <w:sz w:val="17"/>
+                <w:sz w:val="16"/>
               </w:rPr>
-              <w:t>51</w:t>
+              <w:t>0.233</w:t>
             </w:r>
           </w:p>
         </w:tc>
         <w:tc>
           <w:tcPr>
-            <w:tcW w:type="dxa" w:w="900"/>
+            <w:tcW w:type="dxa" w:w="1300"/>
             <w:vAlign w:val="center"/>
           </w:tcPr>
           <w:p>
@@ -1529,15 +2018,15 @@
                 <w:rFonts w:ascii="Calibri" w:hAnsi="Calibri"/>
                 <w:b w:val="0"/>
                 <w:i w:val="0"/>
-                <w:sz w:val="17"/>
+                <w:sz w:val="16"/>
               </w:rPr>
-              <w:t>20</w:t>
+              <w:t>higher in case</w:t>
             </w:r>
           </w:p>
         </w:tc>
         <w:tc>
           <w:tcPr>
-            <w:tcW w:type="dxa" w:w="1100"/>
+            <w:tcW w:type="dxa" w:w="2960"/>
             <w:vAlign w:val="center"/>
           </w:tcPr>
           <w:p>
@@ -1549,15 +2038,20 @@
                 <w:rFonts w:ascii="Calibri" w:hAnsi="Calibri"/>
                 <w:b w:val="0"/>
                 <w:i w:val="0"/>
-                <w:sz w:val="17"/>
+                <w:sz w:val="16"/>
               </w:rPr>
-              <w:t>-0.005</w:t>
+              <w:t>directional only incompatible scales</w:t>
             </w:r>
           </w:p>
         </w:tc>
+      </w:tr>
+      <w:tr>
+        <w:trPr>
+          <w:cantSplit/>
+        </w:trPr>
         <w:tc>
           <w:tcPr>
-            <w:tcW w:type="dxa" w:w="2110"/>
+            <w:tcW w:type="dxa" w:w="1050"/>
             <w:vAlign w:val="center"/>
           </w:tcPr>
           <w:p>
@@ -1569,20 +2063,15 @@
                 <w:rFonts w:ascii="Calibri" w:hAnsi="Calibri"/>
                 <w:b w:val="0"/>
                 <w:i w:val="0"/>
-                <w:sz w:val="17"/>
+                <w:sz w:val="16"/>
               </w:rPr>
-              <w:t>lower in case</w:t>
+              <w:t>GSE299639</w:t>
             </w:r>
           </w:p>
         </w:tc>
-      </w:tr>
-      <w:tr>
-        <w:trPr>
-          <w:cantSplit/>
-        </w:trPr>
         <w:tc>
           <w:tcPr>
-            <w:tcW w:type="dxa" w:w="1350"/>
+            <w:tcW w:type="dxa" w:w="1750"/>
             <w:vAlign w:val="center"/>
           </w:tcPr>
           <w:p>
@@ -1594,15 +2083,15 @@
                 <w:rFonts w:ascii="Calibri" w:hAnsi="Calibri"/>
                 <w:b w:val="0"/>
                 <w:i w:val="0"/>
-                <w:sz w:val="17"/>
+                <w:sz w:val="16"/>
               </w:rPr>
-              <w:t>GSE181364</w:t>
+              <w:t>whole blood RNA sequencing</w:t>
             </w:r>
           </w:p>
         </w:tc>
         <w:tc>
           <w:tcPr>
-            <w:tcW w:type="dxa" w:w="3000"/>
+            <w:tcW w:type="dxa" w:w="650"/>
             <w:vAlign w:val="center"/>
           </w:tcPr>
           <w:p>
@@ -1614,15 +2103,15 @@
                 <w:rFonts w:ascii="Calibri" w:hAnsi="Calibri"/>
                 <w:b w:val="0"/>
                 <w:i w:val="0"/>
-                <w:sz w:val="17"/>
+                <w:sz w:val="16"/>
               </w:rPr>
-              <w:t>whole blood RNA sequencing</w:t>
+              <w:t>6</w:t>
             </w:r>
           </w:p>
         </w:tc>
         <w:tc>
           <w:tcPr>
-            <w:tcW w:type="dxa" w:w="900"/>
+            <w:tcW w:type="dxa" w:w="750"/>
             <w:vAlign w:val="center"/>
           </w:tcPr>
           <w:p>
@@ -1634,132 +2123,7 @@
                 <w:rFonts w:ascii="Calibri" w:hAnsi="Calibri"/>
                 <w:b w:val="0"/>
                 <w:i w:val="0"/>
-                <w:sz w:val="17"/>
-              </w:rPr>
-              <w:t>5</w:t>
-            </w:r>
-          </w:p>
-        </w:tc>
-        <w:tc>
-          <w:tcPr>
-            <w:tcW w:type="dxa" w:w="900"/>
-            <w:vAlign w:val="center"/>
-          </w:tcPr>
-          <w:p>
-            <w:pPr>
-              <w:jc w:val="center"/>
-            </w:pPr>
-            <w:r>
-              <w:rPr>
-                <w:rFonts w:ascii="Calibri" w:hAnsi="Calibri"/>
-                <w:b w:val="0"/>
-                <w:i w:val="0"/>
-                <w:sz w:val="17"/>
-              </w:rPr>
-              <w:t>3</w:t>
-            </w:r>
-          </w:p>
-        </w:tc>
-        <w:tc>
-          <w:tcPr>
-            <w:tcW w:type="dxa" w:w="1100"/>
-            <w:vAlign w:val="center"/>
-          </w:tcPr>
-          <w:p>
-            <w:pPr>
-              <w:jc w:val="center"/>
-            </w:pPr>
-            <w:r>
-              <w:rPr>
-                <w:rFonts w:ascii="Calibri" w:hAnsi="Calibri"/>
-                <w:b w:val="0"/>
-                <w:i w:val="0"/>
-                <w:sz w:val="17"/>
-              </w:rPr>
-              <w:t>0.233</w:t>
-            </w:r>
-          </w:p>
-        </w:tc>
-        <w:tc>
-          <w:tcPr>
-            <w:tcW w:type="dxa" w:w="2110"/>
-            <w:vAlign w:val="center"/>
-          </w:tcPr>
-          <w:p>
-            <w:pPr>
-              <w:jc w:val="center"/>
-            </w:pPr>
-            <w:r>
-              <w:rPr>
-                <w:rFonts w:ascii="Calibri" w:hAnsi="Calibri"/>
-                <w:b w:val="0"/>
-                <w:i w:val="0"/>
-                <w:sz w:val="17"/>
-              </w:rPr>
-              <w:t>higher in case</w:t>
-            </w:r>
-          </w:p>
-        </w:tc>
-      </w:tr>
-      <w:tr>
-        <w:trPr>
-          <w:cantSplit/>
-        </w:trPr>
-        <w:tc>
-          <w:tcPr>
-            <w:tcW w:type="dxa" w:w="1350"/>
-            <w:vAlign w:val="center"/>
-          </w:tcPr>
-          <w:p>
-            <w:pPr>
-              <w:jc w:val="center"/>
-            </w:pPr>
-            <w:r>
-              <w:rPr>
-                <w:rFonts w:ascii="Calibri" w:hAnsi="Calibri"/>
-                <w:b w:val="0"/>
-                <w:i w:val="0"/>
-                <w:sz w:val="17"/>
-              </w:rPr>
-              <w:t>GSE299639</w:t>
-            </w:r>
-          </w:p>
-        </w:tc>
-        <w:tc>
-          <w:tcPr>
-            <w:tcW w:type="dxa" w:w="3000"/>
-            <w:vAlign w:val="center"/>
-          </w:tcPr>
-          <w:p>
-            <w:pPr>
-              <w:jc w:val="center"/>
-            </w:pPr>
-            <w:r>
-              <w:rPr>
-                <w:rFonts w:ascii="Calibri" w:hAnsi="Calibri"/>
-                <w:b w:val="0"/>
-                <w:i w:val="0"/>
-                <w:sz w:val="17"/>
-              </w:rPr>
-              <w:t>whole blood RNA sequencing</w:t>
-            </w:r>
-          </w:p>
-        </w:tc>
-        <w:tc>
-          <w:tcPr>
-            <w:tcW w:type="dxa" w:w="900"/>
-            <w:vAlign w:val="center"/>
-          </w:tcPr>
-          <w:p>
-            <w:pPr>
-              <w:jc w:val="center"/>
-            </w:pPr>
-            <w:r>
-              <w:rPr>
-                <w:rFonts w:ascii="Calibri" w:hAnsi="Calibri"/>
-                <w:b w:val="0"/>
-                <w:i w:val="0"/>
-                <w:sz w:val="17"/>
+                <w:sz w:val="16"/>
               </w:rPr>
               <w:t>6</w:t>
             </w:r>
@@ -1779,15 +2143,15 @@
                 <w:rFonts w:ascii="Calibri" w:hAnsi="Calibri"/>
                 <w:b w:val="0"/>
                 <w:i w:val="0"/>
-                <w:sz w:val="17"/>
+                <w:sz w:val="16"/>
               </w:rPr>
-              <w:t>6</w:t>
+              <w:t>-0.331</w:t>
             </w:r>
           </w:p>
         </w:tc>
         <w:tc>
           <w:tcPr>
-            <w:tcW w:type="dxa" w:w="1100"/>
+            <w:tcW w:type="dxa" w:w="1300"/>
             <w:vAlign w:val="center"/>
           </w:tcPr>
           <w:p>
@@ -1799,15 +2163,15 @@
                 <w:rFonts w:ascii="Calibri" w:hAnsi="Calibri"/>
                 <w:b w:val="0"/>
                 <w:i w:val="0"/>
-                <w:sz w:val="17"/>
+                <w:sz w:val="16"/>
               </w:rPr>
-              <w:t>-0.331</w:t>
+              <w:t>lower in case</w:t>
             </w:r>
           </w:p>
         </w:tc>
         <w:tc>
           <w:tcPr>
-            <w:tcW w:type="dxa" w:w="2110"/>
+            <w:tcW w:type="dxa" w:w="2960"/>
             <w:vAlign w:val="center"/>
           </w:tcPr>
           <w:p>
@@ -1819,9 +2183,9 @@
                 <w:rFonts w:ascii="Calibri" w:hAnsi="Calibri"/>
                 <w:b w:val="0"/>
                 <w:i w:val="0"/>
-                <w:sz w:val="17"/>
+                <w:sz w:val="16"/>
               </w:rPr>
-              <w:t>lower in case</w:t>
+              <w:t>directional only incompatible scales</w:t>
             </w:r>
           </w:p>
         </w:tc>
@@ -1981,6 +2345,86 @@
           <w:sz w:val="20"/>
         </w:rPr>
         <w:t>Pais J, Koshman D. AXIS: auditable molecular evidence synthesis and therapeutic hypothesis generation. Version 0.2.0. Zenodo. 2026. doi:10.5281/zenodo.21762169.</w:t>
+      </w:r>
+    </w:p>
+    <w:p>
+      <w:pPr>
+        <w:pStyle w:val="ListNumber"/>
+        <w:spacing w:after="120"/>
+        <w:ind w:left="403" w:hanging="259"/>
+      </w:pPr>
+      <w:r>
+        <w:rPr>
+          <w:rFonts w:ascii="Calibri" w:hAnsi="Calibri"/>
+          <w:b w:val="0"/>
+          <w:i w:val="0"/>
+          <w:sz w:val="20"/>
+        </w:rPr>
+        <w:t>Murphy AE, Skene NG. A balanced measure shows superior performance of pseudobulk methods in single-cell RNA-sequencing analysis. Nat Commun. 2022;13:7851. doi:10.1038/s41467-022-35519-4.</w:t>
+      </w:r>
+    </w:p>
+    <w:p>
+      <w:pPr>
+        <w:pStyle w:val="ListNumber"/>
+        <w:spacing w:after="120"/>
+        <w:ind w:left="403" w:hanging="259"/>
+      </w:pPr>
+      <w:r>
+        <w:rPr>
+          <w:rFonts w:ascii="Calibri" w:hAnsi="Calibri"/>
+          <w:b w:val="0"/>
+          <w:i w:val="0"/>
+          <w:sz w:val="20"/>
+        </w:rPr>
+        <w:t>Ritchie ME, et al. limma powers differential expression analyses for RNA-sequencing and microarray studies. Nucleic Acids Res. 2015;43:e47. doi:10.1093/nar/gkv007.</w:t>
+      </w:r>
+    </w:p>
+    <w:p>
+      <w:pPr>
+        <w:pStyle w:val="ListNumber"/>
+        <w:spacing w:after="120"/>
+        <w:ind w:left="403" w:hanging="259"/>
+      </w:pPr>
+      <w:r>
+        <w:rPr>
+          <w:rFonts w:ascii="Calibri" w:hAnsi="Calibri"/>
+          <w:b w:val="0"/>
+          <w:i w:val="0"/>
+          <w:sz w:val="20"/>
+        </w:rPr>
+        <w:t>DerSimonian R, Laird N. Meta-analysis in clinical trials. Control Clin Trials. 1986;7:177-188. doi:10.1016/0197-2456(86)90046-2.</w:t>
+      </w:r>
+    </w:p>
+    <w:p>
+      <w:pPr>
+        <w:pStyle w:val="ListNumber"/>
+        <w:spacing w:after="120"/>
+        <w:ind w:left="403" w:hanging="259"/>
+      </w:pPr>
+      <w:r>
+        <w:rPr>
+          <w:rFonts w:ascii="Calibri" w:hAnsi="Calibri"/>
+          <w:b w:val="0"/>
+          <w:i w:val="0"/>
+          <w:sz w:val="20"/>
+        </w:rPr>
+        <w:t>Benjamini Y, Hochberg Y. Controlling the false discovery rate: a practical and powerful approach to multiple testing. J R Stat Soc B. 1995;57:289-300. doi:10.1111/j.2517-6161.1995.tb02031.x.</w:t>
+      </w:r>
+    </w:p>
+    <w:p>
+      <w:pPr>
+        <w:pStyle w:val="ListNumber"/>
+        <w:spacing w:after="120"/>
+        <w:ind w:left="403" w:hanging="259"/>
+      </w:pPr>
+      <w:r>
+        <w:rPr>
+          <w:rFonts w:ascii="Calibri" w:hAnsi="Calibri"/>
+          <w:b w:val="0"/>
+          <w:i w:val="0"/>
+          <w:sz w:val="20"/>
+        </w:rPr>
+        <w:t>Barrett T, et al. NCBI GEO: archive for functional genomics data sets-update. Nucleic Acids Res. 2013;41:D991-D995. doi:10.1093/nar/gks1193.</w:t>
       </w:r>
     </w:p>
     <w:sectPr>

</xml_diff>